<commit_message>
Fix U4 exam page 2: keep vector text at normal size (no raster fit).
</commit_message>
<xml_diff>
--- a/printables/u04/04-考前测试/U4_四上_第四单元_加法模型和乘法模型.docx
+++ b/printables/u04/04-考前测试/U4_四上_第四单元_加法模型和乘法模型.docx
@@ -752,7 +752,7 @@
     </w:p>
     <w:p>
       <w:pPr>
-        <w:spacing w:after="120" w:line="307" w:lineRule="auto"/>
+        <w:spacing w:after="80" w:line="307" w:lineRule="auto"/>
         <w:rPr>
           <w:rFonts w:hint="eastAsia"/>
         </w:rPr>
@@ -763,7 +763,7 @@
     </w:p>
     <w:p>
       <w:pPr>
-        <w:spacing w:before="80" w:after="240"/>
+        <w:spacing w:before="80" w:after="80"/>
         <w:jc w:val="center"/>
         <w:rPr>
           <w:rFonts w:hint="eastAsia"/>
@@ -774,8 +774,8 @@
           <w:noProof/>
         </w:rPr>
         <w:drawing>
-          <wp:inline distT="0" distB="0" distL="0" distR="0" wp14:anchorId="670681DB" wp14:editId="7FB08CD1">
-            <wp:extent cx="2232000" cy="1753714"/>
+          <wp:inline distT="0" distB="0" distL="0" distR="0" wp14:anchorId="7B00DBF2" wp14:editId="6B02D3A3">
+            <wp:extent cx="1655999" cy="1301142"/>
             <wp:effectExtent l="0" t="0" r="0" b="0"/>
             <wp:docPr id="1" name="Picture 1"/>
             <wp:cNvGraphicFramePr>
@@ -797,7 +797,7 @@
                   <pic:spPr>
                     <a:xfrm>
                       <a:off x="0" y="0"/>
-                      <a:ext cx="2232000" cy="1753714"/>
+                      <a:ext cx="1655999" cy="1301142"/>
                     </a:xfrm>
                     <a:prstGeom prst="rect">
                       <a:avLst/>
@@ -827,68 +827,24 @@
     </w:p>
     <w:p>
       <w:pPr>
-        <w:spacing w:after="80" w:line="307" w:lineRule="auto"/>
-        <w:rPr>
-          <w:rFonts w:hint="eastAsia"/>
-        </w:rPr>
-      </w:pPr>
-      <w:r>
-        <w:t>1. 我国高铁技术发展迅速，复兴号列车的运营时速最高可达每小时 350 千米。一列高铁以这个速度行驶 15 分钟能行驶多少千米？是求（　　）。</w:t>
-      </w:r>
-    </w:p>
-    <w:p>
-      <w:pPr>
-        <w:spacing w:line="307" w:lineRule="auto"/>
-        <w:rPr>
-          <w:rFonts w:hint="eastAsia"/>
-        </w:rPr>
-      </w:pPr>
-      <w:r>
-        <w:t xml:space="preserve">　　① 速度　　② 路程　　③ 时间　　④ 车次</w:t>
-      </w:r>
-    </w:p>
-    <w:p>
-      <w:pPr>
-        <w:spacing w:after="80" w:line="307" w:lineRule="auto"/>
-        <w:rPr>
-          <w:rFonts w:hint="eastAsia"/>
-        </w:rPr>
-      </w:pPr>
-      <w:r>
-        <w:t>2. 体育社团购买 10 个同样的篮球，花了 400 元，每个篮球多少元？是求（　　）。</w:t>
-      </w:r>
-    </w:p>
-    <w:p>
-      <w:pPr>
-        <w:spacing w:line="307" w:lineRule="auto"/>
-        <w:rPr>
-          <w:rFonts w:hint="eastAsia"/>
-        </w:rPr>
-      </w:pPr>
-      <w:r>
-        <w:t xml:space="preserve">　　① 单价　　② 数量　　③ 总价　　④ 速度</w:t>
-      </w:r>
-    </w:p>
-    <w:p>
-      <w:pPr>
-        <w:spacing w:after="80" w:line="307" w:lineRule="auto"/>
-        <w:rPr>
-          <w:rFonts w:hint="eastAsia"/>
-        </w:rPr>
-      </w:pPr>
-      <w:r>
-        <w:t>3. 比一比，（　　）的速度最快。</w:t>
-      </w:r>
-    </w:p>
-    <w:p>
-      <w:pPr>
         <w:spacing w:after="60" w:line="307" w:lineRule="auto"/>
         <w:rPr>
           <w:rFonts w:hint="eastAsia"/>
         </w:rPr>
       </w:pPr>
       <w:r>
-        <w:t xml:space="preserve">　　① 八级大风：速度约为 20 米/秒</w:t>
+        <w:t>1. 我国高铁技术发展迅速，复兴号列车的运营时速最高可达每小时 350 千米。一列高铁以这个速度行驶 15 分钟能行驶多少千米？是求（　　）。</w:t>
+      </w:r>
+    </w:p>
+    <w:p>
+      <w:pPr>
+        <w:spacing w:after="120" w:line="307" w:lineRule="auto"/>
+        <w:rPr>
+          <w:rFonts w:hint="eastAsia"/>
+        </w:rPr>
+      </w:pPr>
+      <w:r>
+        <w:t xml:space="preserve">　　① 速度　　② 路程　　③ 时间　　④ 车次</w:t>
       </w:r>
     </w:p>
     <w:p>
@@ -899,7 +855,18 @@
         </w:rPr>
       </w:pPr>
       <w:r>
-        <w:t xml:space="preserve">　　② 高速列车：速度约为 5 千米/分</w:t>
+        <w:t>2. 体育社团购买 10 个同样的篮球，花了 400 元，每个篮球多少元？是求（　　）。</w:t>
+      </w:r>
+    </w:p>
+    <w:p>
+      <w:pPr>
+        <w:spacing w:after="120" w:line="307" w:lineRule="auto"/>
+        <w:rPr>
+          <w:rFonts w:hint="eastAsia"/>
+        </w:rPr>
+      </w:pPr>
+      <w:r>
+        <w:t xml:space="preserve">　　① 单价　　② 数量　　③ 总价　　④ 速度</w:t>
       </w:r>
     </w:p>
     <w:p>
@@ -910,34 +877,45 @@
         </w:rPr>
       </w:pPr>
       <w:r>
-        <w:t xml:space="preserve">　　③ 民用客机：速度约为 900 千米/时</w:t>
+        <w:t>3. 比一比，（　　）的速度最快。</w:t>
       </w:r>
     </w:p>
     <w:p>
       <w:pPr>
-        <w:spacing w:after="160" w:line="307" w:lineRule="auto"/>
+        <w:spacing w:after="40" w:line="307" w:lineRule="auto"/>
         <w:rPr>
           <w:rFonts w:hint="eastAsia"/>
         </w:rPr>
       </w:pPr>
       <w:r>
-        <w:t xml:space="preserve">　　④ 小轿车：速度约为 90 千米/时</w:t>
+        <w:t xml:space="preserve">　　① 八级大风：约 20 米/秒　　② 高速列车：约 5 千米/分</w:t>
       </w:r>
     </w:p>
     <w:p>
       <w:pPr>
-        <w:spacing w:after="80" w:line="307" w:lineRule="auto"/>
+        <w:spacing w:after="120" w:line="307" w:lineRule="auto"/>
         <w:rPr>
           <w:rFonts w:hint="eastAsia"/>
         </w:rPr>
       </w:pPr>
       <w:r>
-        <w:t>4. 城城骑自行车锻炼身体，每分钟行 225 米，12 分钟行多少米？竖式中箭头所指的这一步是在计算（　　）。</w:t>
+        <w:t xml:space="preserve">　　③ 民用客机：约 900 千米/时　　④ 小轿车：约 90 千米/时</w:t>
       </w:r>
     </w:p>
     <w:p>
       <w:pPr>
-        <w:spacing w:before="80" w:after="120"/>
+        <w:spacing w:after="60" w:line="307" w:lineRule="auto"/>
+        <w:rPr>
+          <w:rFonts w:hint="eastAsia"/>
+        </w:rPr>
+      </w:pPr>
+      <w:r>
+        <w:t>4. 城城骑自行车锻炼身体，每分钟行 225 米，12 分钟行多少米？竖式中箭头所指的这一步是在计算（　　）。</w:t>
+      </w:r>
+    </w:p>
+    <w:p>
+      <w:pPr>
+        <w:spacing w:before="80" w:after="60"/>
         <w:jc w:val="center"/>
         <w:rPr>
           <w:rFonts w:hint="eastAsia"/>
@@ -948,8 +926,8 @@
           <w:noProof/>
         </w:rPr>
         <w:drawing>
-          <wp:inline distT="0" distB="0" distL="0" distR="0" wp14:anchorId="33171B19" wp14:editId="18775A96">
-            <wp:extent cx="2232000" cy="1753714"/>
+          <wp:inline distT="0" distB="0" distL="0" distR="0" wp14:anchorId="667E16D0" wp14:editId="0E3E1A7C">
+            <wp:extent cx="1655999" cy="1301142"/>
             <wp:effectExtent l="0" t="0" r="0" b="0"/>
             <wp:docPr id="2" name="Picture 2"/>
             <wp:cNvGraphicFramePr>
@@ -971,7 +949,7 @@
                   <pic:spPr>
                     <a:xfrm>
                       <a:off x="0" y="0"/>
-                      <a:ext cx="2232000" cy="1753714"/>
+                      <a:ext cx="1655999" cy="1301142"/>
                     </a:xfrm>
                     <a:prstGeom prst="rect">
                       <a:avLst/>
@@ -986,24 +964,68 @@
     </w:p>
     <w:p>
       <w:pPr>
+        <w:spacing w:after="40" w:line="307" w:lineRule="auto"/>
+        <w:rPr>
+          <w:rFonts w:hint="eastAsia"/>
+        </w:rPr>
+      </w:pPr>
+      <w:r>
+        <w:t xml:space="preserve">　　① 1 分钟可以行多少米　　② 2 分钟可以行多少米</w:t>
+      </w:r>
+    </w:p>
+    <w:p>
+      <w:pPr>
+        <w:spacing w:after="120" w:line="307" w:lineRule="auto"/>
+        <w:rPr>
+          <w:rFonts w:hint="eastAsia"/>
+        </w:rPr>
+      </w:pPr>
+      <w:r>
+        <w:t xml:space="preserve">　　③ 10 分钟可以行多少米　　④ 12 分钟可以行多少米</w:t>
+      </w:r>
+    </w:p>
+    <w:p>
+      <w:pPr>
         <w:spacing w:after="60" w:line="307" w:lineRule="auto"/>
         <w:rPr>
           <w:rFonts w:hint="eastAsia"/>
         </w:rPr>
       </w:pPr>
       <w:r>
-        <w:t xml:space="preserve">　　① 1 分钟可以行多少米　　② 2 分钟可以行多少米</w:t>
+        <w:t>5. 下面不能用 15×4 解决的是选项（　　）中的问题。</w:t>
       </w:r>
     </w:p>
     <w:p>
       <w:pPr>
-        <w:spacing w:after="160" w:line="307" w:lineRule="auto"/>
+        <w:spacing w:after="40" w:line="307" w:lineRule="auto"/>
         <w:rPr>
           <w:rFonts w:hint="eastAsia"/>
         </w:rPr>
       </w:pPr>
       <w:r>
-        <w:t xml:space="preserve">　　③ 10 分钟可以行多少米　　④ 12 分钟可以行多少米</w:t>
+        <w:t xml:space="preserve">　　① 一根彩带长 15 米，4 根一共长多少米？</w:t>
+      </w:r>
+    </w:p>
+    <w:p>
+      <w:pPr>
+        <w:spacing w:after="40" w:line="307" w:lineRule="auto"/>
+        <w:rPr>
+          <w:rFonts w:hint="eastAsia"/>
+        </w:rPr>
+      </w:pPr>
+      <w:r>
+        <w:t xml:space="preserve">　　② 甲有 15 元，乙是甲的 4 倍，乙有多少钱？</w:t>
+      </w:r>
+    </w:p>
+    <w:p>
+      <w:pPr>
+        <w:spacing w:after="40" w:line="307" w:lineRule="auto"/>
+        <w:rPr>
+          <w:rFonts w:hint="eastAsia"/>
+        </w:rPr>
+      </w:pPr>
+      <w:r>
+        <w:t xml:space="preserve">　　③ 宽 15 米，长是宽的 4 倍，求这块地的面积。</w:t>
       </w:r>
     </w:p>
     <w:p>
@@ -1014,51 +1036,7 @@
         </w:rPr>
       </w:pPr>
       <w:r>
-        <w:t>5. 下面不能用 15×4 解决的是选项（　　）中的问题。</w:t>
-      </w:r>
-    </w:p>
-    <w:p>
-      <w:pPr>
-        <w:spacing w:after="60" w:line="307" w:lineRule="auto"/>
-        <w:rPr>
-          <w:rFonts w:hint="eastAsia"/>
-        </w:rPr>
-      </w:pPr>
-      <w:r>
-        <w:t xml:space="preserve">　　① 一根彩带的长度是 15 米，4 根彩带一共长多少米？</w:t>
-      </w:r>
-    </w:p>
-    <w:p>
-      <w:pPr>
-        <w:spacing w:after="60" w:line="307" w:lineRule="auto"/>
-        <w:rPr>
-          <w:rFonts w:hint="eastAsia"/>
-        </w:rPr>
-      </w:pPr>
-      <w:r>
-        <w:t xml:space="preserve">　　② 甲有 15 元，乙的钱数是甲的 4 倍，乙有多少钱？</w:t>
-      </w:r>
-    </w:p>
-    <w:p>
-      <w:pPr>
-        <w:spacing w:after="60" w:line="307" w:lineRule="auto"/>
-        <w:rPr>
-          <w:rFonts w:hint="eastAsia"/>
-        </w:rPr>
-      </w:pPr>
-      <w:r>
-        <w:t xml:space="preserve">　　③ 一块地的宽是 15 米，长是宽的 4 倍，这块地的面积是多少平方米？</w:t>
-      </w:r>
-    </w:p>
-    <w:p>
-      <w:pPr>
-        <w:spacing w:after="120" w:line="307" w:lineRule="auto"/>
-        <w:rPr>
-          <w:rFonts w:hint="eastAsia"/>
-        </w:rPr>
-      </w:pPr>
-      <w:r>
-        <w:t xml:space="preserve">　　④ 鸡蛋原价每千克 20 元，现价是每千克 15 元，买 4 千克需要多少元？</w:t>
+        <w:t xml:space="preserve">　　④ 鸡蛋现价每千克 15 元，买 4 千克需要多少元？（原价 20 元/千克）</w:t>
       </w:r>
     </w:p>
     <w:p>
@@ -1147,10 +1125,10 @@
           <w:noProof/>
         </w:rPr>
         <w:drawing>
-          <wp:inline distT="0" distB="0" distL="0" distR="0" wp14:anchorId="5099CBD8" wp14:editId="372DFEBA">
+          <wp:inline distT="0" distB="0" distL="0" distR="0" wp14:anchorId="1D65A6E2" wp14:editId="5FBFE2F3">
             <wp:extent cx="4320000" cy="864000"/>
             <wp:effectExtent l="0" t="0" r="0" b="0"/>
-            <wp:docPr id="235206625" name="Picture 1"/>
+            <wp:docPr id="619824078" name="Picture 1"/>
             <wp:cNvGraphicFramePr>
               <a:graphicFrameLocks xmlns:a="http://schemas.openxmlformats.org/drawingml/2006/main" noChangeAspect="1"/>
             </wp:cNvGraphicFramePr>
@@ -1387,10 +1365,10 @@
           <w:noProof/>
         </w:rPr>
         <w:drawing>
-          <wp:inline distT="0" distB="0" distL="0" distR="0" wp14:anchorId="1940B0BB" wp14:editId="61C8B386">
+          <wp:inline distT="0" distB="0" distL="0" distR="0" wp14:anchorId="73B4214B" wp14:editId="606E2BE9">
             <wp:extent cx="2880000" cy="1107692"/>
             <wp:effectExtent l="0" t="0" r="0" b="0"/>
-            <wp:docPr id="1861734882" name="Picture 1"/>
+            <wp:docPr id="688284179" name="Picture 1"/>
             <wp:cNvGraphicFramePr>
               <a:graphicFrameLocks xmlns:a="http://schemas.openxmlformats.org/drawingml/2006/main" noChangeAspect="1"/>
             </wp:cNvGraphicFramePr>
@@ -1935,31 +1913,31 @@
       </w:rPr>
     </w:lvl>
   </w:abstractNum>
-  <w:num w:numId="1" w16cid:durableId="1460956977">
+  <w:num w:numId="1" w16cid:durableId="1342010706">
     <w:abstractNumId w:val="8"/>
   </w:num>
-  <w:num w:numId="2" w16cid:durableId="2045514486">
+  <w:num w:numId="2" w16cid:durableId="497307769">
     <w:abstractNumId w:val="6"/>
   </w:num>
-  <w:num w:numId="3" w16cid:durableId="523324297">
+  <w:num w:numId="3" w16cid:durableId="610286910">
     <w:abstractNumId w:val="5"/>
   </w:num>
-  <w:num w:numId="4" w16cid:durableId="1968928650">
+  <w:num w:numId="4" w16cid:durableId="726417608">
     <w:abstractNumId w:val="4"/>
   </w:num>
-  <w:num w:numId="5" w16cid:durableId="1408385727">
+  <w:num w:numId="5" w16cid:durableId="1431924264">
     <w:abstractNumId w:val="7"/>
   </w:num>
-  <w:num w:numId="6" w16cid:durableId="1046756940">
+  <w:num w:numId="6" w16cid:durableId="1716923431">
     <w:abstractNumId w:val="3"/>
   </w:num>
-  <w:num w:numId="7" w16cid:durableId="328560020">
+  <w:num w:numId="7" w16cid:durableId="1813787148">
     <w:abstractNumId w:val="2"/>
   </w:num>
-  <w:num w:numId="8" w16cid:durableId="308482046">
+  <w:num w:numId="8" w16cid:durableId="75447553">
     <w:abstractNumId w:val="1"/>
   </w:num>
-  <w:num w:numId="9" w16cid:durableId="1824466439">
+  <w:num w:numId="9" w16cid:durableId="480461706">
     <w:abstractNumId w:val="0"/>
   </w:num>
 </w:numbering>

</xml_diff>